<commit_message>
Finalized presentation and speech
</commit_message>
<xml_diff>
--- a/PresentationSpeech.docx
+++ b/PresentationSpeech.docx
@@ -8,13 +8,32 @@
       </w:r>
     </w:p>
     <w:p>
-      <w:pPr>
-        <w:rPr>
-          <w:lang w:val="en-US"/>
-        </w:rPr>
-      </w:pPr>
-      <w:r>
-        <w:t xml:space="preserve">Здравствуйте уважаемая аттестационная комиссия! Сегодня я хочу представить вам свою выпускную квалификационную работу на тему «Разработка программной библиотеки для осуществления прямого управления эмбоссером </w:t>
+      <w:r>
+        <w:t>Здравствуйте уважаем</w:t>
+      </w:r>
+      <w:r>
+        <w:t>ые члены</w:t>
+      </w:r>
+      <w:r>
+        <w:t xml:space="preserve"> аттестационн</w:t>
+      </w:r>
+      <w:r>
+        <w:t>ой</w:t>
+      </w:r>
+      <w:r>
+        <w:t xml:space="preserve"> комисси</w:t>
+      </w:r>
+      <w:r>
+        <w:t>и</w:t>
+      </w:r>
+      <w:r>
+        <w:t>! Сегодня я хочу представить ва</w:t>
+      </w:r>
+      <w:r>
+        <w:t>шему вниманию</w:t>
+      </w:r>
+      <w:r>
+        <w:t xml:space="preserve"> свою выпускную квалификационную работу на тему «Разработка программной библиотеки для осуществления прямого управления эмбоссером </w:t>
       </w:r>
       <w:r>
         <w:rPr>
@@ -28,25 +47,21 @@
       <w:r>
         <w:t xml:space="preserve">через </w:t>
       </w:r>
-      <w:proofErr w:type="spellStart"/>
       <w:r>
         <w:rPr>
           <w:lang w:val="en-US"/>
         </w:rPr>
         <w:t>TranzWare</w:t>
       </w:r>
-      <w:proofErr w:type="spellEnd"/>
-      <w:r>
-        <w:t xml:space="preserve"> </w:t>
-      </w:r>
-      <w:proofErr w:type="spellStart"/>
+      <w:r>
+        <w:t xml:space="preserve"> </w:t>
+      </w:r>
       <w:r>
         <w:rPr>
           <w:lang w:val="en-US"/>
         </w:rPr>
         <w:t>CardFactory</w:t>
       </w:r>
-      <w:proofErr w:type="spellEnd"/>
       <w:r>
         <w:t>»</w:t>
       </w:r>
@@ -66,20 +81,38 @@
     </w:p>
     <w:p>
       <w:r>
-        <w:t xml:space="preserve">Для поддержки прямого управления нам был дан не весь эмбоссер, а только его часть – кардридерный модуль. Управление именно им необходимо было реализовать для выполнения поставленной задачи. </w:t>
-      </w:r>
-    </w:p>
-    <w:p>
-      <w:r>
-        <w:t>Как вы можете видеть на рисунке слева, сам модуль состоит из трех четко разделяемых компонентов: блока питания, управляющей платы и кардридеров. Саму управляющую плату вы видите на рисунке справа, все взаимодействие будет осуществляться именно с ней.</w:t>
-      </w:r>
-    </w:p>
-    <w:p>
-      <w:r>
-        <w:t xml:space="preserve">Стоит упомянуть, что кардридером является устройство, которое соединяется с чипом пластиковой карты и предоставляет аппаратный интерфейс взаимодействия с ней, одним словом </w:t>
-      </w:r>
-      <w:r>
-        <w:t>возможно подключить кардридер к ЭВМ и взаимодействовать с чипом карты с помощью программных средств.</w:t>
+        <w:t>Для поддержки прямого управления нам был дан не весь эмбоссер, а только его часть – кардридерный модуль.</w:t>
+      </w:r>
+    </w:p>
+    <w:p>
+      <w:r>
+        <w:t>Как вы можете видеть на рисунке слева, сам модуль состоит из трех компонентов: блока питания, управляющей платы и кардридеров. Саму управляющую плату вы видите на рисунке справа, все взаимодействие будет осуществляться именно с ней.</w:t>
+      </w:r>
+    </w:p>
+    <w:p>
+      <w:r>
+        <w:t xml:space="preserve">Стоит упомянуть, что кардридером является устройство, </w:t>
+      </w:r>
+      <w:r>
+        <w:t xml:space="preserve">в </w:t>
+      </w:r>
+      <w:r>
+        <w:t xml:space="preserve">которое </w:t>
+      </w:r>
+      <w:r>
+        <w:t xml:space="preserve">вставляется пластиковая карта </w:t>
+      </w:r>
+      <w:r>
+        <w:t>и</w:t>
+      </w:r>
+      <w:r>
+        <w:t xml:space="preserve"> которое</w:t>
+      </w:r>
+      <w:r>
+        <w:t xml:space="preserve"> предоставляет интерфейс взаимодействия с </w:t>
+      </w:r>
+      <w:r>
+        <w:t>ее чипом.</w:t>
       </w:r>
     </w:p>
     <w:p>
@@ -102,14 +135,12 @@
       <w:r>
         <w:t xml:space="preserve"> средствами </w:t>
       </w:r>
-      <w:proofErr w:type="spellStart"/>
       <w:r>
         <w:rPr>
           <w:lang w:val="en-US"/>
         </w:rPr>
         <w:t>CardFactory</w:t>
       </w:r>
-      <w:proofErr w:type="spellEnd"/>
       <w:r>
         <w:t xml:space="preserve"> с </w:t>
       </w:r>
@@ -131,28 +162,24 @@
       <w:r>
         <w:t xml:space="preserve"> Для начала карты загружаются в кардридер, где происходит запись их чипов средствами </w:t>
       </w:r>
-      <w:proofErr w:type="spellStart"/>
       <w:r>
         <w:rPr>
           <w:lang w:val="en-US"/>
         </w:rPr>
         <w:t>CardFactory</w:t>
       </w:r>
-      <w:proofErr w:type="spellEnd"/>
       <w:r>
         <w:t xml:space="preserve">. </w:t>
       </w:r>
       <w:r>
         <w:t xml:space="preserve">После этого карты физически переносятся в эмбоссер и обрабатываются средствами специального ПО </w:t>
       </w:r>
-      <w:proofErr w:type="spellStart"/>
       <w:r>
         <w:rPr>
           <w:lang w:val="en-US"/>
         </w:rPr>
         <w:t>Maticard</w:t>
       </w:r>
-      <w:proofErr w:type="spellEnd"/>
       <w:r>
         <w:t xml:space="preserve"> </w:t>
       </w:r>
@@ -168,25 +195,21 @@
       <w:r>
         <w:t xml:space="preserve"> При этом все данные для эмбоссирования </w:t>
       </w:r>
-      <w:proofErr w:type="spellStart"/>
       <w:r>
         <w:rPr>
           <w:lang w:val="en-US"/>
         </w:rPr>
         <w:t>Maticard</w:t>
       </w:r>
-      <w:proofErr w:type="spellEnd"/>
       <w:r>
         <w:t xml:space="preserve"> получает из </w:t>
       </w:r>
-      <w:proofErr w:type="spellStart"/>
       <w:r>
         <w:rPr>
           <w:lang w:val="en-US"/>
         </w:rPr>
         <w:t>CardFactory</w:t>
       </w:r>
-      <w:proofErr w:type="spellEnd"/>
       <w:r>
         <w:t>.</w:t>
       </w:r>
@@ -243,49 +266,61 @@
     </w:p>
     <w:p>
       <w:r>
-        <w:t xml:space="preserve">Для начала рассмотрим структуру программного продукта </w:t>
-      </w:r>
-      <w:proofErr w:type="spellStart"/>
+        <w:t>Для начала рассмотрим</w:t>
+      </w:r>
+      <w:r>
+        <w:t xml:space="preserve"> упрощенную</w:t>
+      </w:r>
+      <w:r>
+        <w:t xml:space="preserve"> структуру программного продукта </w:t>
+      </w:r>
       <w:r>
         <w:rPr>
           <w:lang w:val="en-US"/>
         </w:rPr>
         <w:t>TranzWare</w:t>
       </w:r>
-      <w:proofErr w:type="spellEnd"/>
-      <w:r>
-        <w:t xml:space="preserve"> </w:t>
-      </w:r>
-      <w:proofErr w:type="spellStart"/>
+      <w:r>
+        <w:t xml:space="preserve"> </w:t>
+      </w:r>
       <w:r>
         <w:rPr>
           <w:lang w:val="en-US"/>
         </w:rPr>
         <w:t>CardFactory</w:t>
       </w:r>
-      <w:proofErr w:type="spellEnd"/>
       <w:r>
         <w:t xml:space="preserve">. </w:t>
       </w:r>
       <w:r>
-        <w:t>Он используется для настройки этапов обработки пластиковой карты, хранения этих настроек и осуществления непосредственной обработки карты</w:t>
-      </w:r>
-      <w:r>
-        <w:t xml:space="preserve">. Для настройки обработки в </w:t>
-      </w:r>
-      <w:proofErr w:type="spellStart"/>
+        <w:t>Он используется для настройки этапов обработки пластиковой карты, хранения этих настроек и осуществления обработки</w:t>
+      </w:r>
+      <w:r>
+        <w:t xml:space="preserve">. Для настройки </w:t>
+      </w:r>
+      <w:r>
+        <w:t xml:space="preserve">этапов </w:t>
+      </w:r>
+      <w:r>
+        <w:t xml:space="preserve">в </w:t>
+      </w:r>
       <w:r>
         <w:rPr>
           <w:lang w:val="en-US"/>
         </w:rPr>
         <w:t>CardFactory</w:t>
       </w:r>
-      <w:proofErr w:type="spellEnd"/>
-      <w:r>
-        <w:t xml:space="preserve"> </w:t>
-      </w:r>
-      <w:r>
-        <w:t xml:space="preserve">используются «карточные продукты». Они состоят из наборов модулей, которые добавляются пользователем и представляют этапы обработки карты. Каждому модулю соответствуют собственные модули настроек и обработки. Модули настроек имеют собственный интерфейс и позволяют подробно настраивать этап и сохранять настройки в необходимых расположениях. Модули обработки же последовательно выполняются при запуске обработки карты и выполняют этапы при этом подгружая настройки. Разрабатываемый драйвер подгружается и используется именно модулем обработки </w:t>
+      <w:r>
+        <w:t xml:space="preserve"> </w:t>
+      </w:r>
+      <w:r>
+        <w:t>используются «карточные продукты». Они состоят из наборов модулей, которые добавляются пользователем и представляют этапы обработки карты. Каждому модулю соответствуют собственные модули настроек и обработки. Модули настроек имеют собственный интерфейс и позволяют подробно настраивать этап</w:t>
+      </w:r>
+      <w:r>
+        <w:t>ы</w:t>
+      </w:r>
+      <w:r>
+        <w:t xml:space="preserve"> и сохранять настройки в необходимых расположениях. Модули обработки же последовательно выполняются при запуске обработки карты и выполняют этапы при этом подгружая настройки. Разрабатываемый драйвер подгружается и используется именно модулем обработки </w:t>
       </w:r>
       <w:r>
         <w:rPr>
@@ -325,7 +360,7 @@
     </w:p>
     <w:p>
       <w:r>
-        <w:t xml:space="preserve">Вернемся к кардридерному модулю. Его обязательно необходимо было подключать к управляющей ЭВМ через внутреннюю сеть или же напрямую кабелем </w:t>
+        <w:t xml:space="preserve">Вернемся к кардридерному модулю. Его обязательно необходимо подключать к управляющей ЭВМ через внутреннюю сеть или же напрямую кабелем </w:t>
       </w:r>
       <w:r>
         <w:rPr>
@@ -346,14 +381,12 @@
       <w:r>
         <w:t xml:space="preserve">Общая схема взаимодействия с кардридерным модулем должна выглядеть следующим образом. Обработка карты запускается в </w:t>
       </w:r>
-      <w:proofErr w:type="spellStart"/>
       <w:r>
         <w:rPr>
           <w:lang w:val="en-US"/>
         </w:rPr>
         <w:t>CardFactory</w:t>
       </w:r>
-      <w:proofErr w:type="spellEnd"/>
       <w:r>
         <w:t xml:space="preserve"> </w:t>
       </w:r>
@@ -393,14 +426,12 @@
       <w:r>
         <w:t xml:space="preserve"> После обработка запускается в </w:t>
       </w:r>
-      <w:proofErr w:type="spellStart"/>
       <w:r>
         <w:rPr>
           <w:lang w:val="en-US"/>
         </w:rPr>
         <w:t>Maticard</w:t>
       </w:r>
-      <w:proofErr w:type="spellEnd"/>
       <w:r>
         <w:t xml:space="preserve"> </w:t>
       </w:r>
@@ -439,7 +470,793 @@
     </w:p>
     <w:p>
       <w:r>
-        <w:t xml:space="preserve"> </w:t>
+        <w:t>Проектное решение модуля обработки</w:t>
+      </w:r>
+      <w:r>
+        <w:t xml:space="preserve"> </w:t>
+      </w:r>
+      <w:r>
+        <w:rPr>
+          <w:lang w:val="en-US"/>
+        </w:rPr>
+        <w:t>Chip</w:t>
+      </w:r>
+      <w:r>
+        <w:t xml:space="preserve"> </w:t>
+      </w:r>
+      <w:r>
+        <w:rPr>
+          <w:lang w:val="en-US"/>
+        </w:rPr>
+        <w:t>Writer</w:t>
+      </w:r>
+      <w:r>
+        <w:t xml:space="preserve"> </w:t>
+      </w:r>
+      <w:r>
+        <w:rPr>
+          <w:lang w:val="en-US"/>
+        </w:rPr>
+        <w:t>Driver</w:t>
+      </w:r>
+      <w:r>
+        <w:t xml:space="preserve"> состояло в переработке функций </w:t>
+      </w:r>
+      <w:r>
+        <w:rPr>
+          <w:lang w:val="en-US"/>
+        </w:rPr>
+        <w:t>Start</w:t>
+      </w:r>
+      <w:r>
+        <w:t xml:space="preserve"> </w:t>
+      </w:r>
+      <w:r>
+        <w:t xml:space="preserve">и </w:t>
+      </w:r>
+      <w:r>
+        <w:rPr>
+          <w:lang w:val="en-US"/>
+        </w:rPr>
+        <w:t>StartReaderInterfaces</w:t>
+      </w:r>
+      <w:r>
+        <w:t xml:space="preserve"> </w:t>
+      </w:r>
+      <w:r>
+        <w:t xml:space="preserve">для правильной подгрузки настроек и их внесения в драйвер. При запуске модуля, запускается функция </w:t>
+      </w:r>
+      <w:r>
+        <w:rPr>
+          <w:lang w:val="en-US"/>
+        </w:rPr>
+        <w:t>Start</w:t>
+      </w:r>
+      <w:r>
+        <w:t xml:space="preserve">, </w:t>
+      </w:r>
+      <w:r>
+        <w:t xml:space="preserve">которая подгружает настройки и записывает их в объекты модуля. Если был выбран </w:t>
+      </w:r>
+      <w:r>
+        <w:lastRenderedPageBreak/>
+        <w:t xml:space="preserve">однопоточный режим записи, то функция </w:t>
+      </w:r>
+      <w:r>
+        <w:rPr>
+          <w:lang w:val="en-US"/>
+        </w:rPr>
+        <w:t>Start</w:t>
+      </w:r>
+      <w:r>
+        <w:t xml:space="preserve"> подгружает в специальную инстанцию два драйвера и </w:t>
+      </w:r>
+      <w:r>
+        <w:t xml:space="preserve">запускает функцию </w:t>
+      </w:r>
+      <w:r>
+        <w:rPr>
+          <w:lang w:val="en-US"/>
+        </w:rPr>
+        <w:t>Start</w:t>
+      </w:r>
+      <w:r>
+        <w:t xml:space="preserve"> </w:t>
+      </w:r>
+      <w:r>
+        <w:t xml:space="preserve">инстанции, в которой вызывается функция </w:t>
+      </w:r>
+      <w:r>
+        <w:rPr>
+          <w:lang w:val="en-US"/>
+        </w:rPr>
+        <w:t>Personalization</w:t>
+      </w:r>
+      <w:r>
+        <w:t xml:space="preserve"> </w:t>
+      </w:r>
+      <w:r>
+        <w:t xml:space="preserve">драйвера записи карты. В ней прописан весь алгоритм записи чипа, который постоянно обращается к функциям драйвера </w:t>
+      </w:r>
+      <w:r>
+        <w:rPr>
+          <w:lang w:val="en-US"/>
+        </w:rPr>
+        <w:t>MATICA</w:t>
+      </w:r>
+      <w:r>
+        <w:t xml:space="preserve"> </w:t>
+      </w:r>
+      <w:r>
+        <w:t xml:space="preserve">для выполнения операций над кардридером или передачи данных на чип карты. Возможно также выбрать и многопоточный режим, при этом вся инициализация будет происходить в функции </w:t>
+      </w:r>
+      <w:r>
+        <w:rPr>
+          <w:lang w:val="en-US"/>
+        </w:rPr>
+        <w:t>StartReaderInterfaces</w:t>
+      </w:r>
+      <w:r>
+        <w:t xml:space="preserve">. </w:t>
+      </w:r>
+      <w:r>
+        <w:t>Единственное отличие в том, что последняя функция создаст несколько инстанций вместо одной.</w:t>
+      </w:r>
+    </w:p>
+    <w:p>
+      <w:r>
+        <w:t>Слайд 10</w:t>
+      </w:r>
+    </w:p>
+    <w:p>
+      <w:r>
+        <w:t xml:space="preserve">Сам разработанный драйвер выступает только в роли интерфейса между драйвером записи карты и кардридерным модулем. Он предоставляет все необходимые функции для инициализации подключения, передачи данных и безопасного завершения работы с кардридерным модулем. Драйвер записи карты постоянно обращается к функциям драйвера </w:t>
+      </w:r>
+      <w:r>
+        <w:rPr>
+          <w:lang w:val="en-US"/>
+        </w:rPr>
+        <w:t>MATICA</w:t>
+      </w:r>
+      <w:r>
+        <w:t xml:space="preserve">, </w:t>
+      </w:r>
+      <w:r>
+        <w:t xml:space="preserve">который составляет нужные команды на специальном языке программирования </w:t>
+      </w:r>
+      <w:r>
+        <w:rPr>
+          <w:lang w:val="en-US"/>
+        </w:rPr>
+        <w:t>TCPScript</w:t>
+      </w:r>
+      <w:r>
+        <w:t xml:space="preserve"> </w:t>
+      </w:r>
+      <w:r>
+        <w:t>и отправляет их на управляющую плату. Она их обрабатывает и возвращает ответ как результат последней команды в виде строки.</w:t>
+      </w:r>
+    </w:p>
+    <w:p>
+      <w:r>
+        <w:t>Слайд 11</w:t>
+      </w:r>
+    </w:p>
+    <w:p>
+      <w:r>
+        <w:t xml:space="preserve">По итогу, разработанный драйвер позволил сделать процесс производства карт с использованием эмбоссеров </w:t>
+      </w:r>
+      <w:r>
+        <w:rPr>
+          <w:lang w:val="en-US"/>
+        </w:rPr>
+        <w:t>MATICA</w:t>
+      </w:r>
+      <w:r>
+        <w:t xml:space="preserve"> </w:t>
+      </w:r>
+      <w:r>
+        <w:t xml:space="preserve">средствами </w:t>
+      </w:r>
+      <w:r>
+        <w:rPr>
+          <w:lang w:val="en-US"/>
+        </w:rPr>
+        <w:t>CardFactory</w:t>
+      </w:r>
+      <w:r>
+        <w:t xml:space="preserve"> </w:t>
+      </w:r>
+      <w:r>
+        <w:t xml:space="preserve">непрерывным. Как вы можете видеть на схеме, теперь полностью отсутствует отдельный этап записи пластиковой карты через кардридер, </w:t>
+      </w:r>
+      <w:r>
+        <w:rPr>
+          <w:lang w:val="en-US"/>
+        </w:rPr>
+        <w:t>Maticard</w:t>
+      </w:r>
+      <w:r>
+        <w:t xml:space="preserve"> </w:t>
+      </w:r>
+      <w:r>
+        <w:rPr>
+          <w:lang w:val="en-US"/>
+        </w:rPr>
+        <w:t>PRO</w:t>
+      </w:r>
+      <w:r>
+        <w:t xml:space="preserve"> </w:t>
+      </w:r>
+      <w:r>
+        <w:t xml:space="preserve">передает специальный сигнал </w:t>
+      </w:r>
+      <w:r>
+        <w:rPr>
+          <w:lang w:val="en-US"/>
+        </w:rPr>
+        <w:t>CardFactory</w:t>
+      </w:r>
+      <w:r>
+        <w:t xml:space="preserve"> </w:t>
+      </w:r>
+      <w:r>
+        <w:t xml:space="preserve">для начала обработки </w:t>
+      </w:r>
+      <w:r>
+        <w:t xml:space="preserve">чипа когда карты поступают в кардридерный модуль и они записываются </w:t>
+      </w:r>
+      <w:r>
+        <w:t>с помощью разработанного драйвера</w:t>
+      </w:r>
+      <w:r>
+        <w:t>.</w:t>
+      </w:r>
+      <w:r>
+        <w:t xml:space="preserve"> После сигнал передается обратно</w:t>
+      </w:r>
+      <w:r>
+        <w:t xml:space="preserve"> </w:t>
+      </w:r>
+      <w:r>
+        <w:t xml:space="preserve">в </w:t>
+      </w:r>
+      <w:r>
+        <w:rPr>
+          <w:lang w:val="en-US"/>
+        </w:rPr>
+        <w:t>Maticard</w:t>
+      </w:r>
+      <w:r>
+        <w:t xml:space="preserve"> </w:t>
+      </w:r>
+      <w:r>
+        <w:rPr>
+          <w:lang w:val="en-US"/>
+        </w:rPr>
+        <w:t>PRO</w:t>
+      </w:r>
+      <w:r>
+        <w:t xml:space="preserve"> </w:t>
+      </w:r>
+      <w:r>
+        <w:t>и обработка карт продолжается до завершения.</w:t>
+      </w:r>
+    </w:p>
+    <w:p>
+      <w:r>
+        <w:t>Слайд 12</w:t>
+      </w:r>
+    </w:p>
+    <w:p>
+      <w:r>
+        <w:t xml:space="preserve">По итогу все задачи были выполнены в полном объеме и </w:t>
+      </w:r>
+      <w:r>
+        <w:t>поставленная цель</w:t>
+      </w:r>
+      <w:r>
+        <w:t xml:space="preserve"> была успешно </w:t>
+      </w:r>
+      <w:r>
+        <w:t>достигнута</w:t>
+      </w:r>
+      <w:r>
+        <w:t>.</w:t>
+      </w:r>
+    </w:p>
+    <w:p>
+      <w:r>
+        <w:t>Полученное программное решение даст р</w:t>
+      </w:r>
+      <w:r>
+        <w:t>я</w:t>
+      </w:r>
+      <w:r>
+        <w:t>д преимуществ компании компас плюс и ее клиентам, а именно:</w:t>
+      </w:r>
+    </w:p>
+    <w:p>
+      <w:pPr>
+        <w:pStyle w:val="ListParagraph"/>
+        <w:numPr>
+          <w:ilvl w:val="0"/>
+          <w:numId w:val="1"/>
+        </w:numPr>
+      </w:pPr>
+      <w:r>
+        <w:t xml:space="preserve">Повышение скорости выпуска карт при использовании эмбоссеров </w:t>
+      </w:r>
+      <w:r>
+        <w:rPr>
+          <w:lang w:val="en-US"/>
+        </w:rPr>
+        <w:t>MATICA</w:t>
+      </w:r>
+    </w:p>
+    <w:p>
+      <w:pPr>
+        <w:pStyle w:val="ListParagraph"/>
+        <w:numPr>
+          <w:ilvl w:val="0"/>
+          <w:numId w:val="1"/>
+        </w:numPr>
+      </w:pPr>
+      <w:r>
+        <w:t xml:space="preserve">Отсутствие необходимости прерывать процесс персонализации карты при ииспользовании </w:t>
+      </w:r>
+      <w:r>
+        <w:rPr>
+          <w:lang w:val="en-US"/>
+        </w:rPr>
+        <w:t>CardFactory</w:t>
+      </w:r>
+    </w:p>
+    <w:p>
+      <w:pPr>
+        <w:pStyle w:val="ListParagraph"/>
+        <w:numPr>
+          <w:ilvl w:val="0"/>
+          <w:numId w:val="1"/>
+        </w:numPr>
+      </w:pPr>
+      <w:r>
+        <w:t>Возможность удаленной работы с кардридерным модулем</w:t>
+      </w:r>
+    </w:p>
+    <w:p>
+      <w:pPr>
+        <w:pStyle w:val="ListParagraph"/>
+        <w:numPr>
+          <w:ilvl w:val="0"/>
+          <w:numId w:val="1"/>
+        </w:numPr>
+      </w:pPr>
+      <w:r>
+        <w:t>Возможность изменения настроек кардридерного модуля.</w:t>
+      </w:r>
+    </w:p>
+    <w:p>
+      <w:pPr>
+        <w:spacing w:after="0"/>
+      </w:pPr>
+      <w:r>
+        <w:t>Слайд 13</w:t>
+      </w:r>
+    </w:p>
+    <w:p>
+      <w:pPr>
+        <w:spacing w:after="0"/>
+      </w:pPr>
+      <w:r>
+        <w:t>Теперь позвольте перейти к показу ролика готового продукта.</w:t>
+      </w:r>
+    </w:p>
+    <w:p>
+      <w:pPr>
+        <w:spacing w:after="0"/>
+      </w:pPr>
+      <w:r>
+        <w:t xml:space="preserve">Кроме того, позвольте показать ролик одного из клиентов компании в Нигерии, </w:t>
+      </w:r>
+      <w:r>
+        <w:t>который уже</w:t>
+      </w:r>
+      <w:r>
+        <w:t xml:space="preserve"> внедрил разработанное программное решение драйвера.</w:t>
+      </w:r>
+    </w:p>
+    <w:p>
+      <w:pPr>
+        <w:spacing w:after="0"/>
+        <w:rPr>
+          <w:lang w:val="en-US"/>
+        </w:rPr>
+      </w:pPr>
+      <w:r>
+        <w:lastRenderedPageBreak/>
+        <w:t>Возмоные вопросы</w:t>
+      </w:r>
+    </w:p>
+    <w:p>
+      <w:pPr>
+        <w:spacing w:after="0"/>
+        <w:rPr>
+          <w:lang w:val="en-US"/>
+        </w:rPr>
+      </w:pPr>
+    </w:p>
+    <w:p>
+      <w:pPr>
+        <w:spacing w:after="0"/>
+      </w:pPr>
+      <w:r>
+        <w:t>А что здесь сделали вы?</w:t>
+      </w:r>
+    </w:p>
+    <w:p>
+      <w:pPr>
+        <w:spacing w:after="0"/>
+      </w:pPr>
+      <w:r>
+        <w:t>Доработал</w:t>
+      </w:r>
+      <w:r>
+        <w:t xml:space="preserve"> </w:t>
+      </w:r>
+      <w:r>
+        <w:t>модуль</w:t>
+      </w:r>
+      <w:r>
+        <w:t xml:space="preserve"> </w:t>
+      </w:r>
+      <w:r>
+        <w:rPr>
+          <w:lang w:val="en-US"/>
+        </w:rPr>
+        <w:t>Chip</w:t>
+      </w:r>
+      <w:r>
+        <w:t xml:space="preserve"> </w:t>
+      </w:r>
+      <w:r>
+        <w:rPr>
+          <w:lang w:val="en-US"/>
+        </w:rPr>
+        <w:t>Writer</w:t>
+      </w:r>
+      <w:r>
+        <w:t xml:space="preserve"> </w:t>
+      </w:r>
+      <w:r>
+        <w:rPr>
+          <w:lang w:val="en-US"/>
+        </w:rPr>
+        <w:t>Driver</w:t>
+      </w:r>
+      <w:r>
+        <w:t xml:space="preserve"> </w:t>
+      </w:r>
+      <w:r>
+        <w:t xml:space="preserve">для правильной подгрузки настроек и возможности их выставления, а также разработал сам драйвер </w:t>
+      </w:r>
+      <w:r>
+        <w:rPr>
+          <w:lang w:val="en-US"/>
+        </w:rPr>
+        <w:t>MATICA</w:t>
+      </w:r>
+      <w:r>
+        <w:t xml:space="preserve"> и внедрил его в </w:t>
+      </w:r>
+      <w:r>
+        <w:rPr>
+          <w:lang w:val="en-US"/>
+        </w:rPr>
+        <w:t>CardFactory</w:t>
+      </w:r>
+      <w:r>
+        <w:t>.</w:t>
+      </w:r>
+    </w:p>
+    <w:p>
+      <w:pPr>
+        <w:spacing w:after="0"/>
+        <w:rPr>
+          <w:lang w:val="en-US"/>
+        </w:rPr>
+      </w:pPr>
+    </w:p>
+    <w:p>
+      <w:pPr>
+        <w:spacing w:after="0"/>
+      </w:pPr>
+      <w:r>
+        <w:t xml:space="preserve">Каким образом </w:t>
+      </w:r>
+      <w:r>
+        <w:rPr>
+          <w:lang w:val="en-US"/>
+        </w:rPr>
+        <w:t>Maticard</w:t>
+      </w:r>
+      <w:r>
+        <w:t xml:space="preserve"> </w:t>
+      </w:r>
+      <w:r>
+        <w:t>связвыается с модулем обработки?</w:t>
+      </w:r>
+    </w:p>
+    <w:p>
+      <w:pPr>
+        <w:spacing w:after="0"/>
+      </w:pPr>
+      <w:r>
+        <w:t xml:space="preserve">С помощью специального </w:t>
+      </w:r>
+      <w:r>
+        <w:rPr>
+          <w:lang w:val="en-US"/>
+        </w:rPr>
+        <w:t>xml</w:t>
+      </w:r>
+      <w:r>
+        <w:t xml:space="preserve"> </w:t>
+      </w:r>
+      <w:r>
+        <w:t xml:space="preserve">файла обмена. </w:t>
+      </w:r>
+      <w:r>
+        <w:t xml:space="preserve">При настройке в </w:t>
+      </w:r>
+      <w:r>
+        <w:rPr>
+          <w:lang w:val="en-US"/>
+        </w:rPr>
+        <w:t>Chip</w:t>
+      </w:r>
+      <w:r>
+        <w:t xml:space="preserve"> </w:t>
+      </w:r>
+      <w:r>
+        <w:rPr>
+          <w:lang w:val="en-US"/>
+        </w:rPr>
+        <w:t>Writer</w:t>
+      </w:r>
+      <w:r>
+        <w:t xml:space="preserve"> </w:t>
+      </w:r>
+      <w:r>
+        <w:rPr>
+          <w:lang w:val="en-US"/>
+        </w:rPr>
+        <w:t>Driver</w:t>
+      </w:r>
+      <w:r>
+        <w:t xml:space="preserve"> и </w:t>
+      </w:r>
+      <w:r>
+        <w:rPr>
+          <w:lang w:val="en-US"/>
+        </w:rPr>
+        <w:t>Maticard</w:t>
+      </w:r>
+      <w:r>
+        <w:t xml:space="preserve"> </w:t>
+      </w:r>
+      <w:r>
+        <w:t>выставляются используемые файлы обмена</w:t>
+      </w:r>
+      <w:r>
+        <w:t xml:space="preserve"> </w:t>
+      </w:r>
+      <w:r>
+        <w:t>через которые будут передаваться сообщени</w:t>
+      </w:r>
+      <w:r>
+        <w:t xml:space="preserve">я. При запуске модуля </w:t>
+      </w:r>
+      <w:r>
+        <w:rPr>
+          <w:lang w:val="en-US"/>
+        </w:rPr>
+        <w:t>Chip</w:t>
+      </w:r>
+      <w:r>
+        <w:t xml:space="preserve"> </w:t>
+      </w:r>
+      <w:r>
+        <w:rPr>
+          <w:lang w:val="en-US"/>
+        </w:rPr>
+        <w:t>Writer</w:t>
+      </w:r>
+      <w:r>
+        <w:t xml:space="preserve"> </w:t>
+      </w:r>
+      <w:r>
+        <w:rPr>
+          <w:lang w:val="en-US"/>
+        </w:rPr>
+        <w:t>Driver</w:t>
+      </w:r>
+      <w:r>
+        <w:t xml:space="preserve"> </w:t>
+      </w:r>
+      <w:r>
+        <w:t xml:space="preserve">он ожидает </w:t>
+      </w:r>
+      <w:r>
+        <w:t xml:space="preserve">сообщения в файле, которое туда передает </w:t>
+      </w:r>
+      <w:r>
+        <w:rPr>
+          <w:lang w:val="en-US"/>
+        </w:rPr>
+        <w:t>Maticard</w:t>
+      </w:r>
+      <w:r>
+        <w:t xml:space="preserve">. </w:t>
+      </w:r>
+      <w:r>
+        <w:t xml:space="preserve">По завершению </w:t>
+      </w:r>
+      <w:r>
+        <w:rPr>
+          <w:lang w:val="en-US"/>
+        </w:rPr>
+        <w:t>Chip</w:t>
+      </w:r>
+      <w:r>
+        <w:t xml:space="preserve"> </w:t>
+      </w:r>
+      <w:r>
+        <w:rPr>
+          <w:lang w:val="en-US"/>
+        </w:rPr>
+        <w:t>Writer</w:t>
+      </w:r>
+      <w:r>
+        <w:t xml:space="preserve"> </w:t>
+      </w:r>
+      <w:r>
+        <w:rPr>
+          <w:lang w:val="en-US"/>
+        </w:rPr>
+        <w:t>Driver</w:t>
+      </w:r>
+      <w:r>
+        <w:t xml:space="preserve"> </w:t>
+      </w:r>
+      <w:r>
+        <w:t>передает сообщение обратно через файл.</w:t>
+      </w:r>
+    </w:p>
+    <w:p>
+      <w:pPr>
+        <w:spacing w:after="0"/>
+      </w:pPr>
+    </w:p>
+    <w:p>
+      <w:pPr>
+        <w:spacing w:after="0"/>
+      </w:pPr>
+      <w:r>
+        <w:t xml:space="preserve">Что может представлять из себя внутренняя сеть </w:t>
+      </w:r>
+      <w:r>
+        <w:t>к которой подключается модуль?</w:t>
+      </w:r>
+    </w:p>
+    <w:p>
+      <w:pPr>
+        <w:spacing w:after="0"/>
+      </w:pPr>
+      <w:r>
+        <w:t>Внутренняя сеть может представлять из себя маршрутизатор или же, например, корпоративную сеть.</w:t>
+      </w:r>
+    </w:p>
+    <w:p>
+      <w:pPr>
+        <w:spacing w:after="0"/>
+      </w:pPr>
+    </w:p>
+    <w:p>
+      <w:pPr>
+        <w:spacing w:after="0"/>
+      </w:pPr>
+      <w:r>
+        <w:t>Каким образом подгружаются драйвера в модуль обработки?</w:t>
+      </w:r>
+    </w:p>
+    <w:p>
+      <w:pPr>
+        <w:spacing w:after="0"/>
+      </w:pPr>
+      <w:r>
+        <w:t>Все их элементы загружаются внутрь модуля обработки из файлов и используются.</w:t>
+      </w:r>
+    </w:p>
+    <w:p>
+      <w:pPr>
+        <w:spacing w:after="0"/>
+      </w:pPr>
+    </w:p>
+    <w:p>
+      <w:pPr>
+        <w:spacing w:after="0"/>
+      </w:pPr>
+      <w:r>
+        <w:t>Почему блок схема на 9 слайде выполнена не по стандартам?</w:t>
+      </w:r>
+    </w:p>
+    <w:p>
+      <w:pPr>
+        <w:spacing w:after="0"/>
+      </w:pPr>
+      <w:r>
+        <w:t>Представленная схема не является полноценной блок схемой, в ней всего-лишь используются элементы блок схем для отображения деталей работы модуля обработки.</w:t>
+      </w:r>
+    </w:p>
+    <w:p>
+      <w:pPr>
+        <w:spacing w:after="0"/>
+      </w:pPr>
+    </w:p>
+    <w:p>
+      <w:pPr>
+        <w:spacing w:after="0"/>
+      </w:pPr>
+      <w:r>
+        <w:t>Какие решения вы анализировали?</w:t>
+      </w:r>
+    </w:p>
+    <w:p>
+      <w:pPr>
+        <w:spacing w:after="0"/>
+      </w:pPr>
+      <w:r>
+        <w:t>Были проанализированы процессы</w:t>
+      </w:r>
+      <w:r>
+        <w:t xml:space="preserve">, по которым </w:t>
+      </w:r>
+      <w:r>
+        <w:t>на</w:t>
+      </w:r>
+      <w:r>
+        <w:t xml:space="preserve"> данный момент производится выпуск карт у клиентов компании, использующих эмбоссеры </w:t>
+      </w:r>
+      <w:r>
+        <w:rPr>
+          <w:lang w:val="en-US"/>
+        </w:rPr>
+        <w:t>MATICA</w:t>
+      </w:r>
+      <w:r>
+        <w:t>. Описание процессов было предоставлено сотрудниками компании, которые напрямую работают с клиентами.</w:t>
+      </w:r>
+    </w:p>
+    <w:p>
+      <w:pPr>
+        <w:spacing w:after="0"/>
+      </w:pPr>
+    </w:p>
+    <w:p>
+      <w:pPr>
+        <w:spacing w:after="0"/>
+      </w:pPr>
+      <w:r>
+        <w:t>Это все разработанные вами функции в драйвере?</w:t>
+      </w:r>
+    </w:p>
+    <w:p>
+      <w:pPr>
+        <w:spacing w:after="0"/>
+      </w:pPr>
+      <w:r>
+        <w:t>Нет, функций в драйвере присутствует больше, на слайде показаны только те функции, которые входят в интерфейс взаимодействия между двумя драйверами. Такой набор функций обязательно присутстсвует в каждом кардридерном драйвере.</w:t>
       </w:r>
     </w:p>
     <w:sectPr>
@@ -450,6 +1267,127 @@
     </w:sectPr>
   </w:body>
 </w:document>
+</file>
+
+<file path=word/numbering.xml><?xml version="1.0" encoding="utf-8"?>
+<w:numbering xmlns:wpc="http://schemas.microsoft.com/office/word/2010/wordprocessingCanvas" xmlns:cx="http://schemas.microsoft.com/office/drawing/2014/chartex" xmlns:cx1="http://schemas.microsoft.com/office/drawing/2015/9/8/chartex" xmlns:cx2="http://schemas.microsoft.com/office/drawing/2015/10/21/chartex" xmlns:cx3="http://schemas.microsoft.com/office/drawing/2016/5/9/chartex" xmlns:cx4="http://schemas.microsoft.com/office/drawing/2016/5/10/chartex" xmlns:cx5="http://schemas.microsoft.com/office/drawing/2016/5/11/chartex" xmlns:cx6="http://schemas.microsoft.com/office/drawing/2016/5/12/chartex" xmlns:cx7="http://schemas.microsoft.com/office/drawing/2016/5/13/chartex" xmlns:cx8="http://schemas.microsoft.com/office/drawing/2016/5/14/chartex" xmlns:mc="http://schemas.openxmlformats.org/markup-compatibility/2006" xmlns:aink="http://schemas.microsoft.com/office/drawing/2016/ink" xmlns:am3d="http://schemas.microsoft.com/office/drawing/2017/model3d" xmlns:o="urn:schemas-microsoft-com:office:office" xmlns:oel="http://schemas.microsoft.com/office/2019/extlst" xmlns:r="http://schemas.openxmlformats.org/officeDocument/2006/relationships" xmlns:m="http://schemas.openxmlformats.org/officeDocument/2006/math" xmlns:v="urn:schemas-microsoft-com:vml" xmlns:wp14="http://schemas.microsoft.com/office/word/2010/wordprocessingDrawing" xmlns:wp="http://schemas.openxmlformats.org/drawingml/2006/wordprocessingDrawing" xmlns:w10="urn:schemas-microsoft-com:office:word" xmlns:w="http://schemas.openxmlformats.org/wordprocessingml/2006/main" xmlns:w14="http://schemas.microsoft.com/office/word/2010/wordml" xmlns:w15="http://schemas.microsoft.com/office/word/2012/wordml" xmlns:w16cex="http://schemas.microsoft.com/office/word/2018/wordml/cex" xmlns:w16cid="http://schemas.microsoft.com/office/word/2016/wordml/cid" xmlns:w16="http://schemas.microsoft.com/office/word/2018/wordml" xmlns:w16du="http://schemas.microsoft.com/office/word/2023/wordml/word16du" xmlns:w16sdtdh="http://schemas.microsoft.com/office/word/2020/wordml/sdtdatahash" xmlns:w16sdtfl="http://schemas.microsoft.com/office/word/2024/wordml/sdtformatlock" xmlns:w16se="http://schemas.microsoft.com/office/word/2015/wordml/symex" xmlns:wpg="http://schemas.microsoft.com/office/word/2010/wordprocessingGroup" xmlns:wpi="http://schemas.microsoft.com/office/word/2010/wordprocessingInk" xmlns:wne="http://schemas.microsoft.com/office/word/2006/wordml" xmlns:wps="http://schemas.microsoft.com/office/word/2010/wordprocessingShape" mc:Ignorable="w14 w15 w16se w16cid w16 w16cex w16sdtdh w16sdtfl w16du wp14">
+  <w:abstractNum w:abstractNumId="0" w15:restartNumberingAfterBreak="0">
+    <w:nsid w:val="7C6D2E9C"/>
+    <w:multiLevelType w:val="hybridMultilevel"/>
+    <w:tmpl w:val="92F09292"/>
+    <w:lvl w:ilvl="0" w:tplc="04190001">
+      <w:start w:val="1"/>
+      <w:numFmt w:val="bullet"/>
+      <w:lvlText w:val=""/>
+      <w:lvlJc w:val="left"/>
+      <w:pPr>
+        <w:ind w:left="720" w:hanging="360"/>
+      </w:pPr>
+      <w:rPr>
+        <w:rFonts w:ascii="Symbol" w:hAnsi="Symbol" w:hint="default"/>
+      </w:rPr>
+    </w:lvl>
+    <w:lvl w:ilvl="1" w:tplc="04190003" w:tentative="1">
+      <w:start w:val="1"/>
+      <w:numFmt w:val="bullet"/>
+      <w:lvlText w:val="o"/>
+      <w:lvlJc w:val="left"/>
+      <w:pPr>
+        <w:ind w:left="1440" w:hanging="360"/>
+      </w:pPr>
+      <w:rPr>
+        <w:rFonts w:ascii="Courier New" w:hAnsi="Courier New" w:cs="Courier New" w:hint="default"/>
+      </w:rPr>
+    </w:lvl>
+    <w:lvl w:ilvl="2" w:tplc="04190005" w:tentative="1">
+      <w:start w:val="1"/>
+      <w:numFmt w:val="bullet"/>
+      <w:lvlText w:val=""/>
+      <w:lvlJc w:val="left"/>
+      <w:pPr>
+        <w:ind w:left="2160" w:hanging="360"/>
+      </w:pPr>
+      <w:rPr>
+        <w:rFonts w:ascii="Wingdings" w:hAnsi="Wingdings" w:hint="default"/>
+      </w:rPr>
+    </w:lvl>
+    <w:lvl w:ilvl="3" w:tplc="04190001" w:tentative="1">
+      <w:start w:val="1"/>
+      <w:numFmt w:val="bullet"/>
+      <w:lvlText w:val=""/>
+      <w:lvlJc w:val="left"/>
+      <w:pPr>
+        <w:ind w:left="2880" w:hanging="360"/>
+      </w:pPr>
+      <w:rPr>
+        <w:rFonts w:ascii="Symbol" w:hAnsi="Symbol" w:hint="default"/>
+      </w:rPr>
+    </w:lvl>
+    <w:lvl w:ilvl="4" w:tplc="04190003" w:tentative="1">
+      <w:start w:val="1"/>
+      <w:numFmt w:val="bullet"/>
+      <w:lvlText w:val="o"/>
+      <w:lvlJc w:val="left"/>
+      <w:pPr>
+        <w:ind w:left="3600" w:hanging="360"/>
+      </w:pPr>
+      <w:rPr>
+        <w:rFonts w:ascii="Courier New" w:hAnsi="Courier New" w:cs="Courier New" w:hint="default"/>
+      </w:rPr>
+    </w:lvl>
+    <w:lvl w:ilvl="5" w:tplc="04190005" w:tentative="1">
+      <w:start w:val="1"/>
+      <w:numFmt w:val="bullet"/>
+      <w:lvlText w:val=""/>
+      <w:lvlJc w:val="left"/>
+      <w:pPr>
+        <w:ind w:left="4320" w:hanging="360"/>
+      </w:pPr>
+      <w:rPr>
+        <w:rFonts w:ascii="Wingdings" w:hAnsi="Wingdings" w:hint="default"/>
+      </w:rPr>
+    </w:lvl>
+    <w:lvl w:ilvl="6" w:tplc="04190001" w:tentative="1">
+      <w:start w:val="1"/>
+      <w:numFmt w:val="bullet"/>
+      <w:lvlText w:val=""/>
+      <w:lvlJc w:val="left"/>
+      <w:pPr>
+        <w:ind w:left="5040" w:hanging="360"/>
+      </w:pPr>
+      <w:rPr>
+        <w:rFonts w:ascii="Symbol" w:hAnsi="Symbol" w:hint="default"/>
+      </w:rPr>
+    </w:lvl>
+    <w:lvl w:ilvl="7" w:tplc="04190003" w:tentative="1">
+      <w:start w:val="1"/>
+      <w:numFmt w:val="bullet"/>
+      <w:lvlText w:val="o"/>
+      <w:lvlJc w:val="left"/>
+      <w:pPr>
+        <w:ind w:left="5760" w:hanging="360"/>
+      </w:pPr>
+      <w:rPr>
+        <w:rFonts w:ascii="Courier New" w:hAnsi="Courier New" w:cs="Courier New" w:hint="default"/>
+      </w:rPr>
+    </w:lvl>
+    <w:lvl w:ilvl="8" w:tplc="04190005" w:tentative="1">
+      <w:start w:val="1"/>
+      <w:numFmt w:val="bullet"/>
+      <w:lvlText w:val=""/>
+      <w:lvlJc w:val="left"/>
+      <w:pPr>
+        <w:ind w:left="6480" w:hanging="360"/>
+      </w:pPr>
+      <w:rPr>
+        <w:rFonts w:ascii="Wingdings" w:hAnsi="Wingdings" w:hint="default"/>
+      </w:rPr>
+    </w:lvl>
+  </w:abstractNum>
+  <w:num w:numId="1" w16cid:durableId="98182175">
+    <w:abstractNumId w:val="0"/>
+  </w:num>
+</w:numbering>
 </file>
 
 <file path=word/styles.xml><?xml version="1.0" encoding="utf-8"?>
@@ -1055,6 +1993,7 @@
   <w:style w:type="character" w:default="1" w:styleId="DefaultParagraphFont">
     <w:name w:val="Default Paragraph Font"/>
     <w:uiPriority w:val="1"/>
+    <w:semiHidden/>
     <w:unhideWhenUsed/>
   </w:style>
   <w:style w:type="table" w:default="1" w:styleId="TableNormal">
@@ -1664,4 +2603,16 @@
     </a:ext>
   </a:extLst>
 </a:theme>
+</file>
+
+<file path=customXml/item1.xml><?xml version="1.0" encoding="utf-8"?>
+<b:Sources xmlns:b="http://schemas.openxmlformats.org/officeDocument/2006/bibliography" xmlns="http://schemas.openxmlformats.org/officeDocument/2006/bibliography" SelectedStyle="\APASixthEditionOfficeOnline.xsl" StyleName="APA" Version="6"/>
+</file>
+
+<file path=customXml/itemProps1.xml><?xml version="1.0" encoding="utf-8"?>
+<ds:datastoreItem xmlns:ds="http://schemas.openxmlformats.org/officeDocument/2006/customXml" ds:itemID="{A14A69E8-7632-499D-AFDB-82BC1DDA9166}">
+  <ds:schemaRefs>
+    <ds:schemaRef ds:uri="http://schemas.openxmlformats.org/officeDocument/2006/bibliography"/>
+  </ds:schemaRefs>
+</ds:datastoreItem>
 </file>
</xml_diff>

<commit_message>
Committing finalized presentation and document version of diploma to add into institute library system
</commit_message>
<xml_diff>
--- a/PresentationSpeech.docx
+++ b/PresentationSpeech.docx
@@ -86,7 +86,13 @@
     </w:p>
     <w:p>
       <w:r>
-        <w:t>Как вы можете видеть на рисунке слева, сам модуль состоит из трех компонентов: блока питания, управляющей платы и кардридеров. Саму управляющую плату вы видите на рисунке справа, все взаимодействие будет осуществляться именно с ней.</w:t>
+        <w:t>Как вы можете видеть на рисунке слева, сам модуль состоит из трех компонентов: блока питания, управляющей платы и кардридеров.</w:t>
+      </w:r>
+      <w:r>
+        <w:t xml:space="preserve"> У</w:t>
+      </w:r>
+      <w:r>
+        <w:t>правляющую плату вы видите на рисунке справа, все взаимодействие будет осуществляться именно с ней.</w:t>
       </w:r>
     </w:p>
     <w:p>
@@ -240,48 +246,67 @@
     </w:p>
     <w:p>
       <w:r>
-        <w:br w:type="page"/>
-      </w:r>
-    </w:p>
-    <w:p>
+        <w:t>Слайд 5</w:t>
+      </w:r>
+    </w:p>
+    <w:p>
+      <w:r>
+        <w:t>К тому же, можно четко определить задачи исследования.</w:t>
+      </w:r>
+    </w:p>
+    <w:p>
+      <w:r>
+        <w:t>Также разрешите их не зачитывать.</w:t>
+      </w:r>
+    </w:p>
+    <w:p>
+      <w:r>
+        <w:t>Слайд 6</w:t>
+      </w:r>
+    </w:p>
+    <w:p>
+      <w:r>
+        <w:t>Для начала рассмотрим</w:t>
+      </w:r>
+      <w:r>
+        <w:t xml:space="preserve"> упрощенную</w:t>
+      </w:r>
+      <w:r>
+        <w:t xml:space="preserve"> структуру программного продукта </w:t>
+      </w:r>
+      <w:r>
+        <w:rPr>
+          <w:lang w:val="en-US"/>
+        </w:rPr>
+        <w:t>TranzWare</w:t>
+      </w:r>
+      <w:r>
+        <w:t xml:space="preserve"> </w:t>
+      </w:r>
+      <w:r>
+        <w:rPr>
+          <w:lang w:val="en-US"/>
+        </w:rPr>
+        <w:t>CardFactory</w:t>
+      </w:r>
+      <w:r>
+        <w:t xml:space="preserve">. </w:t>
+      </w:r>
+      <w:r>
+        <w:t xml:space="preserve">Он используется для настройки этапов обработки пластиковой карты, </w:t>
+      </w:r>
       <w:r>
         <w:lastRenderedPageBreak/>
-        <w:t>Слайд 5</w:t>
-      </w:r>
-    </w:p>
-    <w:p>
-      <w:r>
-        <w:t>К тому же, можно четко определить задачи исследования.</w:t>
-      </w:r>
-    </w:p>
-    <w:p>
-      <w:r>
-        <w:t>Также разрешите их не зачитывать.</w:t>
-      </w:r>
-    </w:p>
-    <w:p>
-      <w:r>
-        <w:t>Слайд 6</w:t>
-      </w:r>
-    </w:p>
-    <w:p>
-      <w:r>
-        <w:t>Для начала рассмотрим</w:t>
-      </w:r>
-      <w:r>
-        <w:t xml:space="preserve"> упрощенную</w:t>
-      </w:r>
-      <w:r>
-        <w:t xml:space="preserve"> структуру программного продукта </w:t>
-      </w:r>
-      <w:r>
-        <w:rPr>
-          <w:lang w:val="en-US"/>
-        </w:rPr>
-        <w:t>TranzWare</w:t>
-      </w:r>
-      <w:r>
-        <w:t xml:space="preserve"> </w:t>
+        <w:t>хранения этих настроек и осуществления обработки</w:t>
+      </w:r>
+      <w:r>
+        <w:t xml:space="preserve">. Для настройки </w:t>
+      </w:r>
+      <w:r>
+        <w:t xml:space="preserve">этапов </w:t>
+      </w:r>
+      <w:r>
+        <w:t xml:space="preserve">в </w:t>
       </w:r>
       <w:r>
         <w:rPr>
@@ -290,321 +315,297 @@
         <w:t>CardFactory</w:t>
       </w:r>
       <w:r>
+        <w:t xml:space="preserve"> </w:t>
+      </w:r>
+      <w:r>
+        <w:t>используются «карточные продукты». Они состоят из наборов модулей, которые добавляются пользователем и представляют этапы обработки карты. Каждому модулю соответствуют собственные модули настроек и обработки. Модули настроек имеют собственный интерфейс и позволяют подробно настраивать этап</w:t>
+      </w:r>
+      <w:r>
+        <w:t>ы</w:t>
+      </w:r>
+      <w:r>
+        <w:t xml:space="preserve"> и сохранять настройки в необходимых расположениях. Модули обработки же последовательно выполняются при запуске обработки карты и выполняют этапы при этом подгружая настройки. Разрабатываемый драйвер подгружается и используется именно модулем обработки </w:t>
+      </w:r>
+      <w:r>
+        <w:rPr>
+          <w:lang w:val="en-US"/>
+        </w:rPr>
+        <w:t>Chip</w:t>
+      </w:r>
+      <w:r>
+        <w:t xml:space="preserve"> </w:t>
+      </w:r>
+      <w:r>
+        <w:rPr>
+          <w:lang w:val="en-US"/>
+        </w:rPr>
+        <w:t>Writer</w:t>
+      </w:r>
+      <w:r>
+        <w:t xml:space="preserve"> </w:t>
+      </w:r>
+      <w:r>
+        <w:rPr>
+          <w:lang w:val="en-US"/>
+        </w:rPr>
+        <w:t>Driver</w:t>
+      </w:r>
+      <w:r>
+        <w:t>, который отвечает за запись информации на чип карты</w:t>
+      </w:r>
+      <w:r>
+        <w:t>.</w:t>
+      </w:r>
+    </w:p>
+    <w:p>
+      <w:r>
+        <w:t>Слайд 7</w:t>
+      </w:r>
+    </w:p>
+    <w:p>
+      <w:r>
+        <w:t xml:space="preserve">Вернемся к кардридерному модулю. Его обязательно необходимо подключать к управляющей ЭВМ через внутреннюю сеть или же напрямую кабелем </w:t>
+      </w:r>
+      <w:r>
+        <w:rPr>
+          <w:lang w:val="en-US"/>
+        </w:rPr>
+        <w:t>Ethernet</w:t>
+      </w:r>
+      <w:r>
+        <w:t>. Кроме того, модуль имеет достаточно специфический способ сетевого обращения. В сети он имеет несколько зарезервированных адресов, по которым необходимо к нему обращаться. Он имеет базовый адрес – адрес управляющей платы и адреса подключенных кардридеров, которые отсчитываются от базового путем добавления номера кардридера к его младшему байту.</w:t>
+      </w:r>
+    </w:p>
+    <w:p>
+      <w:r>
+        <w:t>Слайд 8</w:t>
+      </w:r>
+    </w:p>
+    <w:p>
+      <w:r>
+        <w:t xml:space="preserve">Общая схема взаимодействия с кардридерным модулем должна выглядеть следующим образом. Обработка карты запускается в </w:t>
+      </w:r>
+      <w:r>
+        <w:rPr>
+          <w:lang w:val="en-US"/>
+        </w:rPr>
+        <w:t>CardFactory</w:t>
+      </w:r>
+      <w:r>
+        <w:t xml:space="preserve"> </w:t>
+      </w:r>
+      <w:r>
+        <w:t xml:space="preserve">и останавливается на модуле </w:t>
+      </w:r>
+      <w:r>
+        <w:rPr>
+          <w:lang w:val="en-US"/>
+        </w:rPr>
+        <w:t>Chip</w:t>
+      </w:r>
+      <w:r>
+        <w:t xml:space="preserve"> </w:t>
+      </w:r>
+      <w:r>
+        <w:rPr>
+          <w:lang w:val="en-US"/>
+        </w:rPr>
+        <w:t>Writer</w:t>
+      </w:r>
+      <w:r>
+        <w:t xml:space="preserve"> </w:t>
+      </w:r>
+      <w:r>
+        <w:rPr>
+          <w:lang w:val="en-US"/>
+        </w:rPr>
+        <w:t>Driver</w:t>
+      </w:r>
+      <w:r>
+        <w:t>, он переходит в режим ожидания</w:t>
+      </w:r>
+      <w:r>
+        <w:t>.</w:t>
+      </w:r>
+      <w:r>
+        <w:t xml:space="preserve"> После обработка запускается в </w:t>
+      </w:r>
+      <w:r>
+        <w:rPr>
+          <w:lang w:val="en-US"/>
+        </w:rPr>
+        <w:t>Maticard</w:t>
+      </w:r>
+      <w:r>
+        <w:t xml:space="preserve"> </w:t>
+      </w:r>
+      <w:r>
+        <w:rPr>
+          <w:lang w:val="en-US"/>
+        </w:rPr>
+        <w:t>PRO</w:t>
+      </w:r>
+      <w:r>
+        <w:t xml:space="preserve"> </w:t>
+      </w:r>
+      <w:r>
+        <w:t xml:space="preserve">и на этапе записи чипа посылает сообщение, сигнализирующее модулю начать работу. Модуль подгружает специальный драйвер записи карты и драйвер </w:t>
+      </w:r>
+      <w:r>
+        <w:rPr>
+          <w:lang w:val="en-US"/>
+        </w:rPr>
+        <w:t>MATICA</w:t>
+      </w:r>
+      <w:r>
+        <w:t xml:space="preserve"> </w:t>
+      </w:r>
+      <w:r>
+        <w:t xml:space="preserve">и запускает главную функцию первого драйвера. Она же в свою очередь будет использовать функции разработанного драйвера для </w:t>
+      </w:r>
+      <w:r>
+        <w:t>взаимодействия с чипом карты через кардридерный модуль.</w:t>
+      </w:r>
+    </w:p>
+    <w:p>
+      <w:r>
+        <w:t>Слайд 9</w:t>
+      </w:r>
+    </w:p>
+    <w:p>
+      <w:r>
+        <w:t>Проектное решение модуля обработки</w:t>
+      </w:r>
+      <w:r>
+        <w:t xml:space="preserve"> </w:t>
+      </w:r>
+      <w:r>
+        <w:rPr>
+          <w:lang w:val="en-US"/>
+        </w:rPr>
+        <w:t>Chip</w:t>
+      </w:r>
+      <w:r>
+        <w:t xml:space="preserve"> </w:t>
+      </w:r>
+      <w:r>
+        <w:rPr>
+          <w:lang w:val="en-US"/>
+        </w:rPr>
+        <w:t>Writer</w:t>
+      </w:r>
+      <w:r>
+        <w:t xml:space="preserve"> </w:t>
+      </w:r>
+      <w:r>
+        <w:rPr>
+          <w:lang w:val="en-US"/>
+        </w:rPr>
+        <w:t>Driver</w:t>
+      </w:r>
+      <w:r>
+        <w:t xml:space="preserve"> состояло в переработке функций </w:t>
+      </w:r>
+      <w:r>
+        <w:rPr>
+          <w:lang w:val="en-US"/>
+        </w:rPr>
+        <w:t>Start</w:t>
+      </w:r>
+      <w:r>
+        <w:t xml:space="preserve"> </w:t>
+      </w:r>
+      <w:r>
+        <w:t xml:space="preserve">и </w:t>
+      </w:r>
+      <w:r>
+        <w:rPr>
+          <w:lang w:val="en-US"/>
+        </w:rPr>
+        <w:t>StartReaderInterfaces</w:t>
+      </w:r>
+      <w:r>
+        <w:t xml:space="preserve"> </w:t>
+      </w:r>
+      <w:r>
+        <w:t xml:space="preserve">для правильной подгрузки настроек и их внесения в драйвер. При запуске модуля, запускается функция </w:t>
+      </w:r>
+      <w:r>
+        <w:rPr>
+          <w:lang w:val="en-US"/>
+        </w:rPr>
+        <w:t>Start</w:t>
+      </w:r>
+      <w:r>
+        <w:t xml:space="preserve">, </w:t>
+      </w:r>
+      <w:r>
+        <w:t xml:space="preserve">которая подгружает настройки и записывает их в объекты модуля. Если был выбран однопоточный режим записи, то функция </w:t>
+      </w:r>
+      <w:r>
+        <w:rPr>
+          <w:lang w:val="en-US"/>
+        </w:rPr>
+        <w:t>Start</w:t>
+      </w:r>
+      <w:r>
+        <w:t xml:space="preserve"> подгружает в специальную инстанцию два драйвера и </w:t>
+      </w:r>
+      <w:r>
+        <w:t xml:space="preserve">запускает функцию </w:t>
+      </w:r>
+      <w:r>
+        <w:rPr>
+          <w:lang w:val="en-US"/>
+        </w:rPr>
+        <w:t>Start</w:t>
+      </w:r>
+      <w:r>
+        <w:t xml:space="preserve"> </w:t>
+      </w:r>
+      <w:r>
+        <w:t xml:space="preserve">инстанции, в которой вызывается функция </w:t>
+      </w:r>
+      <w:r>
+        <w:rPr>
+          <w:lang w:val="en-US"/>
+        </w:rPr>
+        <w:t>Personalization</w:t>
+      </w:r>
+      <w:r>
+        <w:t xml:space="preserve"> </w:t>
+      </w:r>
+      <w:r>
+        <w:t xml:space="preserve">драйвера записи карты. В ней прописан весь алгоритм записи чипа, который постоянно обращается к функциям драйвера </w:t>
+      </w:r>
+      <w:r>
+        <w:rPr>
+          <w:lang w:val="en-US"/>
+        </w:rPr>
+        <w:t>MATICA</w:t>
+      </w:r>
+      <w:r>
+        <w:t xml:space="preserve"> </w:t>
+      </w:r>
+      <w:r>
+        <w:t xml:space="preserve">для выполнения операций над кардридером или передачи данных на чип карты. Возможно также выбрать и многопоточный режим, при этом вся инициализация будет происходить в функции </w:t>
+      </w:r>
+      <w:r>
+        <w:rPr>
+          <w:lang w:val="en-US"/>
+        </w:rPr>
+        <w:t>StartReaderInterfaces</w:t>
+      </w:r>
+      <w:r>
         <w:t xml:space="preserve">. </w:t>
       </w:r>
       <w:r>
-        <w:t>Он используется для настройки этапов обработки пластиковой карты, хранения этих настроек и осуществления обработки</w:t>
-      </w:r>
-      <w:r>
-        <w:t xml:space="preserve">. Для настройки </w:t>
-      </w:r>
-      <w:r>
-        <w:t xml:space="preserve">этапов </w:t>
-      </w:r>
-      <w:r>
-        <w:t xml:space="preserve">в </w:t>
-      </w:r>
-      <w:r>
-        <w:rPr>
-          <w:lang w:val="en-US"/>
-        </w:rPr>
-        <w:t>CardFactory</w:t>
-      </w:r>
-      <w:r>
-        <w:t xml:space="preserve"> </w:t>
-      </w:r>
-      <w:r>
-        <w:t>используются «карточные продукты». Они состоят из наборов модулей, которые добавляются пользователем и представляют этапы обработки карты. Каждому модулю соответствуют собственные модули настроек и обработки. Модули настроек имеют собственный интерфейс и позволяют подробно настраивать этап</w:t>
-      </w:r>
-      <w:r>
-        <w:t>ы</w:t>
-      </w:r>
-      <w:r>
-        <w:t xml:space="preserve"> и сохранять настройки в необходимых расположениях. Модули обработки же последовательно выполняются при запуске обработки карты и выполняют этапы при этом подгружая настройки. Разрабатываемый драйвер подгружается и используется именно модулем обработки </w:t>
-      </w:r>
-      <w:r>
-        <w:rPr>
-          <w:lang w:val="en-US"/>
-        </w:rPr>
-        <w:t>Chip</w:t>
-      </w:r>
-      <w:r>
-        <w:t xml:space="preserve"> </w:t>
-      </w:r>
-      <w:r>
-        <w:rPr>
-          <w:lang w:val="en-US"/>
-        </w:rPr>
-        <w:t>Writer</w:t>
-      </w:r>
-      <w:r>
-        <w:t xml:space="preserve"> </w:t>
-      </w:r>
-      <w:r>
-        <w:rPr>
-          <w:lang w:val="en-US"/>
-        </w:rPr>
-        <w:t>Driver</w:t>
-      </w:r>
-      <w:r>
-        <w:t>, который отвечает за запись информации на чип карты</w:t>
-      </w:r>
-      <w:r>
-        <w:t>.</w:t>
-      </w:r>
-    </w:p>
-    <w:p>
-      <w:r>
-        <w:t>Слайд 7</w:t>
-      </w:r>
-    </w:p>
-    <w:p>
-      <w:r>
-        <w:t xml:space="preserve">Вернемся к кардридерному модулю. Его обязательно необходимо подключать к управляющей ЭВМ через внутреннюю сеть или же напрямую кабелем </w:t>
-      </w:r>
-      <w:r>
-        <w:rPr>
-          <w:lang w:val="en-US"/>
-        </w:rPr>
-        <w:t>Ethernet</w:t>
-      </w:r>
-      <w:r>
-        <w:t>. Кроме того, модуль имеет достаточно специфический способ сетевого обращения. В сети он имеет несколько зарезервированных адресов, по которым необходимо к нему обращаться. Он имеет базовый адрес – адрес управляющей платы и адреса подключенных кардридеров, которые отсчитываются от базового путем добавления номера кардридера к его младшему байту.</w:t>
-      </w:r>
-    </w:p>
-    <w:p>
-      <w:r>
-        <w:t>Слайд 8</w:t>
-      </w:r>
-    </w:p>
-    <w:p>
-      <w:r>
-        <w:t xml:space="preserve">Общая схема взаимодействия с кардридерным модулем должна выглядеть следующим образом. Обработка карты запускается в </w:t>
-      </w:r>
-      <w:r>
-        <w:rPr>
-          <w:lang w:val="en-US"/>
-        </w:rPr>
-        <w:t>CardFactory</w:t>
-      </w:r>
-      <w:r>
-        <w:t xml:space="preserve"> </w:t>
-      </w:r>
-      <w:r>
-        <w:t xml:space="preserve">и останавливается на модуле </w:t>
-      </w:r>
-      <w:r>
-        <w:rPr>
-          <w:lang w:val="en-US"/>
-        </w:rPr>
-        <w:t>Chip</w:t>
-      </w:r>
-      <w:r>
-        <w:t xml:space="preserve"> </w:t>
-      </w:r>
-      <w:r>
-        <w:rPr>
-          <w:lang w:val="en-US"/>
-        </w:rPr>
-        <w:t>Writer</w:t>
-      </w:r>
-      <w:r>
-        <w:t xml:space="preserve"> </w:t>
-      </w:r>
-      <w:r>
-        <w:rPr>
-          <w:lang w:val="en-US"/>
-        </w:rPr>
-        <w:t>Driver</w:t>
-      </w:r>
-      <w:r>
-        <w:t>, он переходит в режим ожидания</w:t>
-      </w:r>
-      <w:r>
-        <w:t>.</w:t>
-      </w:r>
-      <w:r>
-        <w:t xml:space="preserve"> После обработка запускается в </w:t>
-      </w:r>
-      <w:r>
-        <w:rPr>
-          <w:lang w:val="en-US"/>
-        </w:rPr>
-        <w:t>Maticard</w:t>
-      </w:r>
-      <w:r>
-        <w:t xml:space="preserve"> </w:t>
-      </w:r>
-      <w:r>
-        <w:rPr>
-          <w:lang w:val="en-US"/>
-        </w:rPr>
-        <w:t>PRO</w:t>
-      </w:r>
-      <w:r>
-        <w:t xml:space="preserve"> </w:t>
-      </w:r>
-      <w:r>
-        <w:t xml:space="preserve">и на этапе записи чипа посылает сообщение, сигнализирующее модулю начать работу. Модуль подгружает специальный драйвер записи карты и драйвер </w:t>
-      </w:r>
-      <w:r>
-        <w:rPr>
-          <w:lang w:val="en-US"/>
-        </w:rPr>
-        <w:t>MATICA</w:t>
-      </w:r>
-      <w:r>
-        <w:t xml:space="preserve"> </w:t>
-      </w:r>
-      <w:r>
-        <w:t xml:space="preserve">и запускает главную функцию первого драйвера. Она же в свою очередь будет использовать функции разработанного драйвера для </w:t>
-      </w:r>
-      <w:r>
-        <w:t>взаимодействия с чипом карты через кардридерный модуль.</w:t>
-      </w:r>
-    </w:p>
-    <w:p>
-      <w:r>
-        <w:t>Слайд 9</w:t>
-      </w:r>
-    </w:p>
-    <w:p>
-      <w:r>
-        <w:t>Проектное решение модуля обработки</w:t>
-      </w:r>
-      <w:r>
-        <w:t xml:space="preserve"> </w:t>
-      </w:r>
-      <w:r>
-        <w:rPr>
-          <w:lang w:val="en-US"/>
-        </w:rPr>
-        <w:t>Chip</w:t>
-      </w:r>
-      <w:r>
-        <w:t xml:space="preserve"> </w:t>
-      </w:r>
-      <w:r>
-        <w:rPr>
-          <w:lang w:val="en-US"/>
-        </w:rPr>
-        <w:t>Writer</w:t>
-      </w:r>
-      <w:r>
-        <w:t xml:space="preserve"> </w:t>
-      </w:r>
-      <w:r>
-        <w:rPr>
-          <w:lang w:val="en-US"/>
-        </w:rPr>
-        <w:t>Driver</w:t>
-      </w:r>
-      <w:r>
-        <w:t xml:space="preserve"> состояло в переработке функций </w:t>
-      </w:r>
-      <w:r>
-        <w:rPr>
-          <w:lang w:val="en-US"/>
-        </w:rPr>
-        <w:t>Start</w:t>
-      </w:r>
-      <w:r>
-        <w:t xml:space="preserve"> </w:t>
-      </w:r>
-      <w:r>
-        <w:t xml:space="preserve">и </w:t>
-      </w:r>
-      <w:r>
-        <w:rPr>
-          <w:lang w:val="en-US"/>
-        </w:rPr>
-        <w:t>StartReaderInterfaces</w:t>
-      </w:r>
-      <w:r>
-        <w:t xml:space="preserve"> </w:t>
-      </w:r>
-      <w:r>
-        <w:t xml:space="preserve">для правильной подгрузки настроек и их внесения в драйвер. При запуске модуля, запускается функция </w:t>
-      </w:r>
-      <w:r>
-        <w:rPr>
-          <w:lang w:val="en-US"/>
-        </w:rPr>
-        <w:t>Start</w:t>
-      </w:r>
-      <w:r>
-        <w:t xml:space="preserve">, </w:t>
-      </w:r>
-      <w:r>
-        <w:t xml:space="preserve">которая подгружает настройки и записывает их в объекты модуля. Если был выбран </w:t>
-      </w:r>
+        <w:t>Единственное отличие в том, что последняя функция создаст несколько инстанций вместо одной.</w:t>
+      </w:r>
+    </w:p>
+    <w:p>
       <w:r>
         <w:lastRenderedPageBreak/>
-        <w:t xml:space="preserve">однопоточный режим записи, то функция </w:t>
-      </w:r>
-      <w:r>
-        <w:rPr>
-          <w:lang w:val="en-US"/>
-        </w:rPr>
-        <w:t>Start</w:t>
-      </w:r>
-      <w:r>
-        <w:t xml:space="preserve"> подгружает в специальную инстанцию два драйвера и </w:t>
-      </w:r>
-      <w:r>
-        <w:t xml:space="preserve">запускает функцию </w:t>
-      </w:r>
-      <w:r>
-        <w:rPr>
-          <w:lang w:val="en-US"/>
-        </w:rPr>
-        <w:t>Start</w:t>
-      </w:r>
-      <w:r>
-        <w:t xml:space="preserve"> </w:t>
-      </w:r>
-      <w:r>
-        <w:t xml:space="preserve">инстанции, в которой вызывается функция </w:t>
-      </w:r>
-      <w:r>
-        <w:rPr>
-          <w:lang w:val="en-US"/>
-        </w:rPr>
-        <w:t>Personalization</w:t>
-      </w:r>
-      <w:r>
-        <w:t xml:space="preserve"> </w:t>
-      </w:r>
-      <w:r>
-        <w:t xml:space="preserve">драйвера записи карты. В ней прописан весь алгоритм записи чипа, который постоянно обращается к функциям драйвера </w:t>
-      </w:r>
-      <w:r>
-        <w:rPr>
-          <w:lang w:val="en-US"/>
-        </w:rPr>
-        <w:t>MATICA</w:t>
-      </w:r>
-      <w:r>
-        <w:t xml:space="preserve"> </w:t>
-      </w:r>
-      <w:r>
-        <w:t xml:space="preserve">для выполнения операций над кардридером или передачи данных на чип карты. Возможно также выбрать и многопоточный режим, при этом вся инициализация будет происходить в функции </w:t>
-      </w:r>
-      <w:r>
-        <w:rPr>
-          <w:lang w:val="en-US"/>
-        </w:rPr>
-        <w:t>StartReaderInterfaces</w:t>
-      </w:r>
-      <w:r>
-        <w:t xml:space="preserve">. </w:t>
-      </w:r>
-      <w:r>
-        <w:t>Единственное отличие в том, что последняя функция создаст несколько инстанций вместо одной.</w:t>
-      </w:r>
-    </w:p>
-    <w:p>
-      <w:r>
         <w:t>Слайд 10</w:t>
       </w:r>
     </w:p>
@@ -869,129 +870,120 @@
     <w:p>
       <w:pPr>
         <w:spacing w:after="0"/>
-        <w:rPr>
-          <w:lang w:val="en-US"/>
-        </w:rPr>
+      </w:pPr>
+      <w:r>
+        <w:t>Возмоные вопросы</w:t>
+      </w:r>
+    </w:p>
+    <w:p>
+      <w:pPr>
+        <w:spacing w:after="0"/>
+      </w:pPr>
+    </w:p>
+    <w:p>
+      <w:pPr>
+        <w:spacing w:after="0"/>
+      </w:pPr>
+      <w:r>
+        <w:t>А что здесь сделали вы?</w:t>
+      </w:r>
+    </w:p>
+    <w:p>
+      <w:pPr>
+        <w:spacing w:after="0"/>
+      </w:pPr>
+      <w:r>
+        <w:t>Доработал</w:t>
+      </w:r>
+      <w:r>
+        <w:t xml:space="preserve"> </w:t>
+      </w:r>
+      <w:r>
+        <w:t>модуль</w:t>
+      </w:r>
+      <w:r>
+        <w:t xml:space="preserve"> </w:t>
+      </w:r>
+      <w:r>
+        <w:rPr>
+          <w:lang w:val="en-US"/>
+        </w:rPr>
+        <w:t>Chip</w:t>
+      </w:r>
+      <w:r>
+        <w:t xml:space="preserve"> </w:t>
+      </w:r>
+      <w:r>
+        <w:rPr>
+          <w:lang w:val="en-US"/>
+        </w:rPr>
+        <w:t>Writer</w:t>
+      </w:r>
+      <w:r>
+        <w:t xml:space="preserve"> </w:t>
+      </w:r>
+      <w:r>
+        <w:rPr>
+          <w:lang w:val="en-US"/>
+        </w:rPr>
+        <w:t>Driver</w:t>
+      </w:r>
+      <w:r>
+        <w:t xml:space="preserve"> </w:t>
+      </w:r>
+      <w:r>
+        <w:t xml:space="preserve">для правильной подгрузки настроек и возможности их выставления, а также разработал сам драйвер </w:t>
+      </w:r>
+      <w:r>
+        <w:rPr>
+          <w:lang w:val="en-US"/>
+        </w:rPr>
+        <w:t>MATICA</w:t>
+      </w:r>
+      <w:r>
+        <w:t xml:space="preserve"> и внедрил его в </w:t>
+      </w:r>
+      <w:r>
+        <w:rPr>
+          <w:lang w:val="en-US"/>
+        </w:rPr>
+        <w:t>CardFactory</w:t>
+      </w:r>
+      <w:r>
+        <w:t>.</w:t>
+      </w:r>
+    </w:p>
+    <w:p>
+      <w:pPr>
+        <w:spacing w:after="0"/>
+      </w:pPr>
+    </w:p>
+    <w:p>
+      <w:pPr>
+        <w:spacing w:after="0"/>
+      </w:pPr>
+      <w:r>
+        <w:t xml:space="preserve">Каким образом </w:t>
+      </w:r>
+      <w:r>
+        <w:rPr>
+          <w:lang w:val="en-US"/>
+        </w:rPr>
+        <w:t>Maticard</w:t>
+      </w:r>
+      <w:r>
+        <w:t xml:space="preserve"> </w:t>
+      </w:r>
+      <w:r>
+        <w:t>связвыается с модулем обработки?</w:t>
+      </w:r>
+    </w:p>
+    <w:p>
+      <w:pPr>
+        <w:spacing w:after="0"/>
       </w:pPr>
       <w:r>
         <w:lastRenderedPageBreak/>
-        <w:t>Возмоные вопросы</w:t>
-      </w:r>
-    </w:p>
-    <w:p>
-      <w:pPr>
-        <w:spacing w:after="0"/>
-        <w:rPr>
-          <w:lang w:val="en-US"/>
-        </w:rPr>
-      </w:pPr>
-    </w:p>
-    <w:p>
-      <w:pPr>
-        <w:spacing w:after="0"/>
-      </w:pPr>
-      <w:r>
-        <w:t>А что здесь сделали вы?</w:t>
-      </w:r>
-    </w:p>
-    <w:p>
-      <w:pPr>
-        <w:spacing w:after="0"/>
-      </w:pPr>
-      <w:r>
-        <w:t>Доработал</w:t>
-      </w:r>
-      <w:r>
-        <w:t xml:space="preserve"> </w:t>
-      </w:r>
-      <w:r>
-        <w:t>модуль</w:t>
-      </w:r>
-      <w:r>
-        <w:t xml:space="preserve"> </w:t>
-      </w:r>
-      <w:r>
-        <w:rPr>
-          <w:lang w:val="en-US"/>
-        </w:rPr>
-        <w:t>Chip</w:t>
-      </w:r>
-      <w:r>
-        <w:t xml:space="preserve"> </w:t>
-      </w:r>
-      <w:r>
-        <w:rPr>
-          <w:lang w:val="en-US"/>
-        </w:rPr>
-        <w:t>Writer</w:t>
-      </w:r>
-      <w:r>
-        <w:t xml:space="preserve"> </w:t>
-      </w:r>
-      <w:r>
-        <w:rPr>
-          <w:lang w:val="en-US"/>
-        </w:rPr>
-        <w:t>Driver</w:t>
-      </w:r>
-      <w:r>
-        <w:t xml:space="preserve"> </w:t>
-      </w:r>
-      <w:r>
-        <w:t xml:space="preserve">для правильной подгрузки настроек и возможности их выставления, а также разработал сам драйвер </w:t>
-      </w:r>
-      <w:r>
-        <w:rPr>
-          <w:lang w:val="en-US"/>
-        </w:rPr>
-        <w:t>MATICA</w:t>
-      </w:r>
-      <w:r>
-        <w:t xml:space="preserve"> и внедрил его в </w:t>
-      </w:r>
-      <w:r>
-        <w:rPr>
-          <w:lang w:val="en-US"/>
-        </w:rPr>
-        <w:t>CardFactory</w:t>
-      </w:r>
-      <w:r>
-        <w:t>.</w:t>
-      </w:r>
-    </w:p>
-    <w:p>
-      <w:pPr>
-        <w:spacing w:after="0"/>
-        <w:rPr>
-          <w:lang w:val="en-US"/>
-        </w:rPr>
-      </w:pPr>
-    </w:p>
-    <w:p>
-      <w:pPr>
-        <w:spacing w:after="0"/>
-      </w:pPr>
-      <w:r>
-        <w:t xml:space="preserve">Каким образом </w:t>
-      </w:r>
-      <w:r>
-        <w:rPr>
-          <w:lang w:val="en-US"/>
-        </w:rPr>
-        <w:t>Maticard</w:t>
-      </w:r>
-      <w:r>
-        <w:t xml:space="preserve"> </w:t>
-      </w:r>
-      <w:r>
-        <w:t>связвыается с модулем обработки?</w:t>
-      </w:r>
-    </w:p>
-    <w:p>
-      <w:pPr>
-        <w:spacing w:after="0"/>
-      </w:pPr>
-      <w:r>
         <w:t xml:space="preserve">С помощью специального </w:t>
       </w:r>
       <w:r>

</xml_diff>